<commit_message>
tz-travel: no duplicate JSON-LD item in the developer section; rebuild Egypt hub brief
Co-Authored-By: Claude Opus 5.5 <noreply@anthropic.com>
</commit_message>
<xml_diff>
--- a/reisemu-de/aegypten/tz-copywriter-aegypten.docx
+++ b/reisemu-de/aegypten/tz-copywriter-aegypten.docx
@@ -12847,14 +12847,6 @@
       </w:pPr>
       <w:r>
         <w:t>Розмітка JSON-LD: на сторінці її немає; додати BreadcrumbList і FAQPage (для блоку «Häufige Fragen»).</w:t>
-      </w:r>
-    </w:p>
-    <w:p>
-      <w:pPr>
-        <w:pStyle w:val="ListBullet"/>
-      </w:pPr>
-      <w:r>
-        <w:t>JSON-LD: додати розмітку FAQPage, BreadcrumbList (зараз на сторінці розмітки JSON-LD не знайдено).</w:t>
       </w:r>
     </w:p>
     <w:p>

</xml_diff>